<commit_message>
updated with Medium Fixed -P1
</commit_message>
<xml_diff>
--- a/New_Connection.docx
+++ b/New_Connection.docx
@@ -175,17 +175,17 @@
         <w:rPr>
           <w:b w:val="on"/>
         </w:rPr>
-        <w:t xml:space="preserve"> Step5:Opportunity created in Identified status (ID: 4998298939 )</w:t>
-        <w:br/>
-        <w:drawing>
-          <wp:inline distT="0" distR="0" distB="0" distL="0">
-            <wp:extent cx="5524500" cy="2476500"/>
-            <wp:docPr id="4" name="Drawing 4" descr="Step5:Opportunity created in Identified status (ID: 4998298939 )"/>
-            <a:graphic xmlns:a="http://schemas.openxmlformats.org/drawingml/2006/main">
-              <a:graphicData uri="http://schemas.openxmlformats.org/drawingml/2006/picture">
-                <pic:pic xmlns:pic="http://schemas.openxmlformats.org/drawingml/2006/picture">
-                  <pic:nvPicPr>
-                    <pic:cNvPr id="0" name="Picture 4" descr="Step5:Opportunity created in Identified status (ID: 4998298939 )"/>
+        <w:t xml:space="preserve"> Step5:Opportunity created in Identified status (ID: 2231784721 )</w:t>
+        <w:br/>
+        <w:drawing>
+          <wp:inline distT="0" distR="0" distB="0" distL="0">
+            <wp:extent cx="5524500" cy="2476500"/>
+            <wp:docPr id="4" name="Drawing 4" descr="Step5:Opportunity created in Identified status (ID: 2231784721 )"/>
+            <a:graphic xmlns:a="http://schemas.openxmlformats.org/drawingml/2006/main">
+              <a:graphicData uri="http://schemas.openxmlformats.org/drawingml/2006/picture">
+                <pic:pic xmlns:pic="http://schemas.openxmlformats.org/drawingml/2006/picture">
+                  <pic:nvPicPr>
+                    <pic:cNvPr id="0" name="Picture 4" descr="Step5:Opportunity created in Identified status (ID: 2231784721 )"/>
                     <pic:cNvPicPr>
                       <a:picLocks noChangeAspect="true"/>
                     </pic:cNvPicPr>
@@ -595,17 +595,17 @@
         <w:rPr>
           <w:b w:val="on"/>
         </w:rPr>
-        <w:t xml:space="preserve"> Step5:Opportunity created in Identified status (ID: 7467160431 )</w:t>
-        <w:br/>
-        <w:drawing>
-          <wp:inline distT="0" distR="0" distB="0" distL="0">
-            <wp:extent cx="5524500" cy="2476500"/>
-            <wp:docPr id="14" name="Drawing 14" descr="Step5:Opportunity created in Identified status (ID: 7467160431 )"/>
-            <a:graphic xmlns:a="http://schemas.openxmlformats.org/drawingml/2006/main">
-              <a:graphicData uri="http://schemas.openxmlformats.org/drawingml/2006/picture">
-                <pic:pic xmlns:pic="http://schemas.openxmlformats.org/drawingml/2006/picture">
-                  <pic:nvPicPr>
-                    <pic:cNvPr id="0" name="Picture 14" descr="Step5:Opportunity created in Identified status (ID: 7467160431 )"/>
+        <w:t xml:space="preserve"> Step5:Opportunity created in Identified status (ID: 0949882369 )</w:t>
+        <w:br/>
+        <w:drawing>
+          <wp:inline distT="0" distR="0" distB="0" distL="0">
+            <wp:extent cx="5524500" cy="2476500"/>
+            <wp:docPr id="14" name="Drawing 14" descr="Step5:Opportunity created in Identified status (ID: 0949882369 )"/>
+            <a:graphic xmlns:a="http://schemas.openxmlformats.org/drawingml/2006/main">
+              <a:graphicData uri="http://schemas.openxmlformats.org/drawingml/2006/picture">
+                <pic:pic xmlns:pic="http://schemas.openxmlformats.org/drawingml/2006/picture">
+                  <pic:nvPicPr>
+                    <pic:cNvPr id="0" name="Picture 14" descr="Step5:Opportunity created in Identified status (ID: 0949882369 )"/>
                     <pic:cNvPicPr>
                       <a:picLocks noChangeAspect="true"/>
                     </pic:cNvPicPr>
@@ -653,6 +653,48 @@
                     </pic:cNvPicPr>
                   </pic:nvPicPr>
                   <pic:blipFill>
+                    <a:blip r:embed="rId7"/>
+                    <a:stretch>
+                      <a:fillRect/>
+                    </a:stretch>
+                  </pic:blipFill>
+                  <pic:spPr>
+                    <a:xfrm>
+                      <a:off x="0" y="0"/>
+                      <a:ext cx="5524500" cy="2476500"/>
+                    </a:xfrm>
+                    <a:prstGeom prst="rect">
+                      <a:avLst/>
+                    </a:prstGeom>
+                  </pic:spPr>
+                </pic:pic>
+              </a:graphicData>
+            </a:graphic>
+          </wp:inline>
+        </w:drawing>
+      </w:r>
+    </w:p>
+    <w:p>
+      <w:r>
+        <w:rPr>
+          <w:b w:val="on"/>
+        </w:rPr>
+        <w:t xml:space="preserve"> Select MPAN</w:t>
+        <w:br/>
+        <w:drawing>
+          <wp:inline distT="0" distR="0" distB="0" distL="0">
+            <wp:extent cx="5524500" cy="2476500"/>
+            <wp:docPr id="16" name="Drawing 16" descr="Select MPAN"/>
+            <a:graphic xmlns:a="http://schemas.openxmlformats.org/drawingml/2006/main">
+              <a:graphicData uri="http://schemas.openxmlformats.org/drawingml/2006/picture">
+                <pic:pic xmlns:pic="http://schemas.openxmlformats.org/drawingml/2006/picture">
+                  <pic:nvPicPr>
+                    <pic:cNvPr id="0" name="Picture 16" descr="Select MPAN"/>
+                    <pic:cNvPicPr>
+                      <a:picLocks noChangeAspect="true"/>
+                    </pic:cNvPicPr>
+                  </pic:nvPicPr>
+                  <pic:blipFill>
                     <a:blip r:embed="rId17"/>
                     <a:stretch>
                       <a:fillRect/>
@@ -679,17 +721,17 @@
         <w:rPr>
           <w:b w:val="on"/>
         </w:rPr>
-        <w:t xml:space="preserve"> Select MPAN</w:t>
-        <w:br/>
-        <w:drawing>
-          <wp:inline distT="0" distR="0" distB="0" distL="0">
-            <wp:extent cx="5524500" cy="2476500"/>
-            <wp:docPr id="16" name="Drawing 16" descr="Select MPAN"/>
-            <a:graphic xmlns:a="http://schemas.openxmlformats.org/drawingml/2006/main">
-              <a:graphicData uri="http://schemas.openxmlformats.org/drawingml/2006/picture">
-                <pic:pic xmlns:pic="http://schemas.openxmlformats.org/drawingml/2006/picture">
-                  <pic:nvPicPr>
-                    <pic:cNvPr id="0" name="Picture 16" descr="Select MPAN"/>
+        <w:t xml:space="preserve"> Site added succesfully.</w:t>
+        <w:br/>
+        <w:drawing>
+          <wp:inline distT="0" distR="0" distB="0" distL="0">
+            <wp:extent cx="5524500" cy="2476500"/>
+            <wp:docPr id="17" name="Drawing 17" descr="Site added succesfully."/>
+            <a:graphic xmlns:a="http://schemas.openxmlformats.org/drawingml/2006/main">
+              <a:graphicData uri="http://schemas.openxmlformats.org/drawingml/2006/picture">
+                <pic:pic xmlns:pic="http://schemas.openxmlformats.org/drawingml/2006/picture">
+                  <pic:nvPicPr>
+                    <pic:cNvPr id="0" name="Picture 17" descr="Site added succesfully."/>
                     <pic:cNvPicPr>
                       <a:picLocks noChangeAspect="true"/>
                     </pic:cNvPicPr>
@@ -721,17 +763,17 @@
         <w:rPr>
           <w:b w:val="on"/>
         </w:rPr>
-        <w:t xml:space="preserve"> Site added succesfully.</w:t>
-        <w:br/>
-        <w:drawing>
-          <wp:inline distT="0" distR="0" distB="0" distL="0">
-            <wp:extent cx="5524500" cy="2476500"/>
-            <wp:docPr id="17" name="Drawing 17" descr="Site added succesfully."/>
-            <a:graphic xmlns:a="http://schemas.openxmlformats.org/drawingml/2006/main">
-              <a:graphicData uri="http://schemas.openxmlformats.org/drawingml/2006/picture">
-                <pic:pic xmlns:pic="http://schemas.openxmlformats.org/drawingml/2006/picture">
-                  <pic:nvPicPr>
-                    <pic:cNvPr id="0" name="Picture 17" descr="Site added succesfully."/>
+        <w:t xml:space="preserve"> Credit Check Processed Succesfully</w:t>
+        <w:br/>
+        <w:drawing>
+          <wp:inline distT="0" distR="0" distB="0" distL="0">
+            <wp:extent cx="5524500" cy="2476500"/>
+            <wp:docPr id="18" name="Drawing 18" descr="Credit Check Processed Succesfully"/>
+            <a:graphic xmlns:a="http://schemas.openxmlformats.org/drawingml/2006/main">
+              <a:graphicData uri="http://schemas.openxmlformats.org/drawingml/2006/picture">
+                <pic:pic xmlns:pic="http://schemas.openxmlformats.org/drawingml/2006/picture">
+                  <pic:nvPicPr>
+                    <pic:cNvPr id="0" name="Picture 18" descr="Credit Check Processed Succesfully"/>
                     <pic:cNvPicPr>
                       <a:picLocks noChangeAspect="true"/>
                     </pic:cNvPicPr>
@@ -763,17 +805,17 @@
         <w:rPr>
           <w:b w:val="on"/>
         </w:rPr>
-        <w:t xml:space="preserve"> Credit Check Processed Succesfully</w:t>
-        <w:br/>
-        <w:drawing>
-          <wp:inline distT="0" distR="0" distB="0" distL="0">
-            <wp:extent cx="5524500" cy="2476500"/>
-            <wp:docPr id="18" name="Drawing 18" descr="Credit Check Processed Succesfully"/>
-            <a:graphic xmlns:a="http://schemas.openxmlformats.org/drawingml/2006/main">
-              <a:graphicData uri="http://schemas.openxmlformats.org/drawingml/2006/picture">
-                <pic:pic xmlns:pic="http://schemas.openxmlformats.org/drawingml/2006/picture">
-                  <pic:nvPicPr>
-                    <pic:cNvPr id="0" name="Picture 18" descr="Credit Check Processed Succesfully"/>
+        <w:t xml:space="preserve"> Opportunity Qualified</w:t>
+        <w:br/>
+        <w:drawing>
+          <wp:inline distT="0" distR="0" distB="0" distL="0">
+            <wp:extent cx="5524500" cy="2476500"/>
+            <wp:docPr id="19" name="Drawing 19" descr="Opportunity Qualified"/>
+            <a:graphic xmlns:a="http://schemas.openxmlformats.org/drawingml/2006/main">
+              <a:graphicData uri="http://schemas.openxmlformats.org/drawingml/2006/picture">
+                <pic:pic xmlns:pic="http://schemas.openxmlformats.org/drawingml/2006/picture">
+                  <pic:nvPicPr>
+                    <pic:cNvPr id="0" name="Picture 19" descr="Opportunity Qualified"/>
                     <pic:cNvPicPr>
                       <a:picLocks noChangeAspect="true"/>
                     </pic:cNvPicPr>
@@ -805,65 +847,23 @@
         <w:rPr>
           <w:b w:val="on"/>
         </w:rPr>
-        <w:t xml:space="preserve"> Opportunity Qualified</w:t>
-        <w:br/>
-        <w:drawing>
-          <wp:inline distT="0" distR="0" distB="0" distL="0">
-            <wp:extent cx="5524500" cy="2476500"/>
-            <wp:docPr id="19" name="Drawing 19" descr="Opportunity Qualified"/>
-            <a:graphic xmlns:a="http://schemas.openxmlformats.org/drawingml/2006/main">
-              <a:graphicData uri="http://schemas.openxmlformats.org/drawingml/2006/picture">
-                <pic:pic xmlns:pic="http://schemas.openxmlformats.org/drawingml/2006/picture">
-                  <pic:nvPicPr>
-                    <pic:cNvPr id="0" name="Picture 19" descr="Opportunity Qualified"/>
+        <w:t xml:space="preserve"> Opportunity Moved to Won Status</w:t>
+        <w:br/>
+        <w:drawing>
+          <wp:inline distT="0" distR="0" distB="0" distL="0">
+            <wp:extent cx="5524500" cy="2476500"/>
+            <wp:docPr id="20" name="Drawing 20" descr="Opportunity Moved to Won Status"/>
+            <a:graphic xmlns:a="http://schemas.openxmlformats.org/drawingml/2006/main">
+              <a:graphicData uri="http://schemas.openxmlformats.org/drawingml/2006/picture">
+                <pic:pic xmlns:pic="http://schemas.openxmlformats.org/drawingml/2006/picture">
+                  <pic:nvPicPr>
+                    <pic:cNvPr id="0" name="Picture 20" descr="Opportunity Moved to Won Status"/>
                     <pic:cNvPicPr>
                       <a:picLocks noChangeAspect="true"/>
                     </pic:cNvPicPr>
                   </pic:nvPicPr>
                   <pic:blipFill>
                     <a:blip r:embed="rId21"/>
-                    <a:stretch>
-                      <a:fillRect/>
-                    </a:stretch>
-                  </pic:blipFill>
-                  <pic:spPr>
-                    <a:xfrm>
-                      <a:off x="0" y="0"/>
-                      <a:ext cx="5524500" cy="2476500"/>
-                    </a:xfrm>
-                    <a:prstGeom prst="rect">
-                      <a:avLst/>
-                    </a:prstGeom>
-                  </pic:spPr>
-                </pic:pic>
-              </a:graphicData>
-            </a:graphic>
-          </wp:inline>
-        </w:drawing>
-      </w:r>
-    </w:p>
-    <w:p>
-      <w:r>
-        <w:rPr>
-          <w:b w:val="on"/>
-        </w:rPr>
-        <w:t xml:space="preserve"> Opportunity Moved to Won Status</w:t>
-        <w:br/>
-        <w:drawing>
-          <wp:inline distT="0" distR="0" distB="0" distL="0">
-            <wp:extent cx="5524500" cy="2476500"/>
-            <wp:docPr id="20" name="Drawing 20" descr="Opportunity Moved to Won Status"/>
-            <a:graphic xmlns:a="http://schemas.openxmlformats.org/drawingml/2006/main">
-              <a:graphicData uri="http://schemas.openxmlformats.org/drawingml/2006/picture">
-                <pic:pic xmlns:pic="http://schemas.openxmlformats.org/drawingml/2006/picture">
-                  <pic:nvPicPr>
-                    <pic:cNvPr id="0" name="Picture 20" descr="Opportunity Moved to Won Status"/>
-                    <pic:cNvPicPr>
-                      <a:picLocks noChangeAspect="true"/>
-                    </pic:cNvPicPr>
-                  </pic:nvPicPr>
-                  <pic:blipFill>
-                    <a:blip r:embed="rId22"/>
                     <a:stretch>
                       <a:fillRect/>
                     </a:stretch>

</xml_diff>

<commit_message>
updated with latepayment starting
</commit_message>
<xml_diff>
--- a/New_Connection.docx
+++ b/New_Connection.docx
@@ -175,17 +175,17 @@
         <w:rPr>
           <w:b w:val="on"/>
         </w:rPr>
-        <w:t xml:space="preserve"> Step5:Opportunity created in Identified status (ID: 8608311862 )</w:t>
-        <w:br/>
-        <w:drawing>
-          <wp:inline distT="0" distR="0" distB="0" distL="0">
-            <wp:extent cx="5524500" cy="2476500"/>
-            <wp:docPr id="4" name="Drawing 4" descr="Step5:Opportunity created in Identified status (ID: 8608311862 )"/>
-            <a:graphic xmlns:a="http://schemas.openxmlformats.org/drawingml/2006/main">
-              <a:graphicData uri="http://schemas.openxmlformats.org/drawingml/2006/picture">
-                <pic:pic xmlns:pic="http://schemas.openxmlformats.org/drawingml/2006/picture">
-                  <pic:nvPicPr>
-                    <pic:cNvPr id="0" name="Picture 4" descr="Step5:Opportunity created in Identified status (ID: 8608311862 )"/>
+        <w:t xml:space="preserve"> Step5:Opportunity created in Identified status (ID: 8793767397 )</w:t>
+        <w:br/>
+        <w:drawing>
+          <wp:inline distT="0" distR="0" distB="0" distL="0">
+            <wp:extent cx="5524500" cy="2476500"/>
+            <wp:docPr id="4" name="Drawing 4" descr="Step5:Opportunity created in Identified status (ID: 8793767397 )"/>
+            <a:graphic xmlns:a="http://schemas.openxmlformats.org/drawingml/2006/main">
+              <a:graphicData uri="http://schemas.openxmlformats.org/drawingml/2006/picture">
+                <pic:pic xmlns:pic="http://schemas.openxmlformats.org/drawingml/2006/picture">
+                  <pic:nvPicPr>
+                    <pic:cNvPr id="0" name="Picture 4" descr="Step5:Opportunity created in Identified status (ID: 8793767397 )"/>
                     <pic:cNvPicPr>
                       <a:picLocks noChangeAspect="true"/>
                     </pic:cNvPicPr>

</xml_diff>

<commit_message>
updated with COT P2 & Medium Fixed P2
</commit_message>
<xml_diff>
--- a/New_Connection.docx
+++ b/New_Connection.docx
@@ -175,17 +175,17 @@
         <w:rPr>
           <w:b w:val="on"/>
         </w:rPr>
-        <w:t xml:space="preserve"> Step5:Opportunity created in Identified status (ID: 8793767397 )</w:t>
-        <w:br/>
-        <w:drawing>
-          <wp:inline distT="0" distR="0" distB="0" distL="0">
-            <wp:extent cx="5524500" cy="2476500"/>
-            <wp:docPr id="4" name="Drawing 4" descr="Step5:Opportunity created in Identified status (ID: 8793767397 )"/>
-            <a:graphic xmlns:a="http://schemas.openxmlformats.org/drawingml/2006/main">
-              <a:graphicData uri="http://schemas.openxmlformats.org/drawingml/2006/picture">
-                <pic:pic xmlns:pic="http://schemas.openxmlformats.org/drawingml/2006/picture">
-                  <pic:nvPicPr>
-                    <pic:cNvPr id="0" name="Picture 4" descr="Step5:Opportunity created in Identified status (ID: 8793767397 )"/>
+        <w:t xml:space="preserve"> Step5:Opportunity created in Identified status (ID: 3341694363 )</w:t>
+        <w:br/>
+        <w:drawing>
+          <wp:inline distT="0" distR="0" distB="0" distL="0">
+            <wp:extent cx="5524500" cy="2476500"/>
+            <wp:docPr id="4" name="Drawing 4" descr="Step5:Opportunity created in Identified status (ID: 3341694363 )"/>
+            <a:graphic xmlns:a="http://schemas.openxmlformats.org/drawingml/2006/main">
+              <a:graphicData uri="http://schemas.openxmlformats.org/drawingml/2006/picture">
+                <pic:pic xmlns:pic="http://schemas.openxmlformats.org/drawingml/2006/picture">
+                  <pic:nvPicPr>
+                    <pic:cNvPr id="0" name="Picture 4" descr="Step5:Opportunity created in Identified status (ID: 3341694363 )"/>
                     <pic:cNvPicPr>
                       <a:picLocks noChangeAspect="true"/>
                     </pic:cNvPicPr>

</xml_diff>

<commit_message>
updated with comc15 p2 & COMC16P2
</commit_message>
<xml_diff>
--- a/New_Connection.docx
+++ b/New_Connection.docx
@@ -175,17 +175,17 @@
         <w:rPr>
           <w:b w:val="on"/>
         </w:rPr>
-        <w:t xml:space="preserve"> Step5:Opportunity created in Identified status (ID: 3341694363 )</w:t>
-        <w:br/>
-        <w:drawing>
-          <wp:inline distT="0" distR="0" distB="0" distL="0">
-            <wp:extent cx="5524500" cy="2476500"/>
-            <wp:docPr id="4" name="Drawing 4" descr="Step5:Opportunity created in Identified status (ID: 3341694363 )"/>
-            <a:graphic xmlns:a="http://schemas.openxmlformats.org/drawingml/2006/main">
-              <a:graphicData uri="http://schemas.openxmlformats.org/drawingml/2006/picture">
-                <pic:pic xmlns:pic="http://schemas.openxmlformats.org/drawingml/2006/picture">
-                  <pic:nvPicPr>
-                    <pic:cNvPr id="0" name="Picture 4" descr="Step5:Opportunity created in Identified status (ID: 3341694363 )"/>
+        <w:t xml:space="preserve"> Step5:Opportunity created in Identified status (ID: 8052186083 )</w:t>
+        <w:br/>
+        <w:drawing>
+          <wp:inline distT="0" distR="0" distB="0" distL="0">
+            <wp:extent cx="5524500" cy="2476500"/>
+            <wp:docPr id="4" name="Drawing 4" descr="Step5:Opportunity created in Identified status (ID: 8052186083 )"/>
+            <a:graphic xmlns:a="http://schemas.openxmlformats.org/drawingml/2006/main">
+              <a:graphicData uri="http://schemas.openxmlformats.org/drawingml/2006/picture">
+                <pic:pic xmlns:pic="http://schemas.openxmlformats.org/drawingml/2006/picture">
+                  <pic:nvPicPr>
+                    <pic:cNvPr id="0" name="Picture 4" descr="Step5:Opportunity created in Identified status (ID: 8052186083 )"/>
                     <pic:cNvPicPr>
                       <a:picLocks noChangeAspect="true"/>
                     </pic:cNvPicPr>
@@ -234,6 +234,594 @@
                   </pic:nvPicPr>
                   <pic:blipFill>
                     <a:blip r:embed="rId7"/>
+                    <a:stretch>
+                      <a:fillRect/>
+                    </a:stretch>
+                  </pic:blipFill>
+                  <pic:spPr>
+                    <a:xfrm>
+                      <a:off x="0" y="0"/>
+                      <a:ext cx="5524500" cy="2476500"/>
+                    </a:xfrm>
+                    <a:prstGeom prst="rect">
+                      <a:avLst/>
+                    </a:prstGeom>
+                  </pic:spPr>
+                </pic:pic>
+              </a:graphicData>
+            </a:graphic>
+          </wp:inline>
+        </w:drawing>
+      </w:r>
+    </w:p>
+    <w:p>
+      <w:r>
+        <w:rPr>
+          <w:b w:val="on"/>
+        </w:rPr>
+        <w:t xml:space="preserve"> Select MPAN</w:t>
+        <w:br/>
+        <w:drawing>
+          <wp:inline distT="0" distR="0" distB="0" distL="0">
+            <wp:extent cx="5524500" cy="2476500"/>
+            <wp:docPr id="6" name="Drawing 6" descr="Select MPAN"/>
+            <a:graphic xmlns:a="http://schemas.openxmlformats.org/drawingml/2006/main">
+              <a:graphicData uri="http://schemas.openxmlformats.org/drawingml/2006/picture">
+                <pic:pic xmlns:pic="http://schemas.openxmlformats.org/drawingml/2006/picture">
+                  <pic:nvPicPr>
+                    <pic:cNvPr id="0" name="Picture 6" descr="Select MPAN"/>
+                    <pic:cNvPicPr>
+                      <a:picLocks noChangeAspect="true"/>
+                    </pic:cNvPicPr>
+                  </pic:nvPicPr>
+                  <pic:blipFill>
+                    <a:blip r:embed="rId8"/>
+                    <a:stretch>
+                      <a:fillRect/>
+                    </a:stretch>
+                  </pic:blipFill>
+                  <pic:spPr>
+                    <a:xfrm>
+                      <a:off x="0" y="0"/>
+                      <a:ext cx="5524500" cy="2476500"/>
+                    </a:xfrm>
+                    <a:prstGeom prst="rect">
+                      <a:avLst/>
+                    </a:prstGeom>
+                  </pic:spPr>
+                </pic:pic>
+              </a:graphicData>
+            </a:graphic>
+          </wp:inline>
+        </w:drawing>
+      </w:r>
+    </w:p>
+    <w:p>
+      <w:r>
+        <w:rPr>
+          <w:b w:val="on"/>
+        </w:rPr>
+        <w:t xml:space="preserve"> Site added succesfully.</w:t>
+        <w:br/>
+        <w:drawing>
+          <wp:inline distT="0" distR="0" distB="0" distL="0">
+            <wp:extent cx="5524500" cy="2476500"/>
+            <wp:docPr id="7" name="Drawing 7" descr="Site added succesfully."/>
+            <a:graphic xmlns:a="http://schemas.openxmlformats.org/drawingml/2006/main">
+              <a:graphicData uri="http://schemas.openxmlformats.org/drawingml/2006/picture">
+                <pic:pic xmlns:pic="http://schemas.openxmlformats.org/drawingml/2006/picture">
+                  <pic:nvPicPr>
+                    <pic:cNvPr id="0" name="Picture 7" descr="Site added succesfully."/>
+                    <pic:cNvPicPr>
+                      <a:picLocks noChangeAspect="true"/>
+                    </pic:cNvPicPr>
+                  </pic:nvPicPr>
+                  <pic:blipFill>
+                    <a:blip r:embed="rId9"/>
+                    <a:stretch>
+                      <a:fillRect/>
+                    </a:stretch>
+                  </pic:blipFill>
+                  <pic:spPr>
+                    <a:xfrm>
+                      <a:off x="0" y="0"/>
+                      <a:ext cx="5524500" cy="2476500"/>
+                    </a:xfrm>
+                    <a:prstGeom prst="rect">
+                      <a:avLst/>
+                    </a:prstGeom>
+                  </pic:spPr>
+                </pic:pic>
+              </a:graphicData>
+            </a:graphic>
+          </wp:inline>
+        </w:drawing>
+      </w:r>
+    </w:p>
+    <w:p>
+      <w:r>
+        <w:rPr>
+          <w:b w:val="on"/>
+        </w:rPr>
+        <w:t xml:space="preserve"> Credit Check Processed Succesfully</w:t>
+        <w:br/>
+        <w:drawing>
+          <wp:inline distT="0" distR="0" distB="0" distL="0">
+            <wp:extent cx="5524500" cy="2476500"/>
+            <wp:docPr id="8" name="Drawing 8" descr="Credit Check Processed Succesfully"/>
+            <a:graphic xmlns:a="http://schemas.openxmlformats.org/drawingml/2006/main">
+              <a:graphicData uri="http://schemas.openxmlformats.org/drawingml/2006/picture">
+                <pic:pic xmlns:pic="http://schemas.openxmlformats.org/drawingml/2006/picture">
+                  <pic:nvPicPr>
+                    <pic:cNvPr id="0" name="Picture 8" descr="Credit Check Processed Succesfully"/>
+                    <pic:cNvPicPr>
+                      <a:picLocks noChangeAspect="true"/>
+                    </pic:cNvPicPr>
+                  </pic:nvPicPr>
+                  <pic:blipFill>
+                    <a:blip r:embed="rId10"/>
+                    <a:stretch>
+                      <a:fillRect/>
+                    </a:stretch>
+                  </pic:blipFill>
+                  <pic:spPr>
+                    <a:xfrm>
+                      <a:off x="0" y="0"/>
+                      <a:ext cx="5524500" cy="2476500"/>
+                    </a:xfrm>
+                    <a:prstGeom prst="rect">
+                      <a:avLst/>
+                    </a:prstGeom>
+                  </pic:spPr>
+                </pic:pic>
+              </a:graphicData>
+            </a:graphic>
+          </wp:inline>
+        </w:drawing>
+      </w:r>
+    </w:p>
+    <w:p>
+      <w:r>
+        <w:rPr>
+          <w:b w:val="on"/>
+        </w:rPr>
+        <w:t xml:space="preserve"> Opportunity Qualified</w:t>
+        <w:br/>
+        <w:drawing>
+          <wp:inline distT="0" distR="0" distB="0" distL="0">
+            <wp:extent cx="5524500" cy="2476500"/>
+            <wp:docPr id="9" name="Drawing 9" descr="Opportunity Qualified"/>
+            <a:graphic xmlns:a="http://schemas.openxmlformats.org/drawingml/2006/main">
+              <a:graphicData uri="http://schemas.openxmlformats.org/drawingml/2006/picture">
+                <pic:pic xmlns:pic="http://schemas.openxmlformats.org/drawingml/2006/picture">
+                  <pic:nvPicPr>
+                    <pic:cNvPr id="0" name="Picture 9" descr="Opportunity Qualified"/>
+                    <pic:cNvPicPr>
+                      <a:picLocks noChangeAspect="true"/>
+                    </pic:cNvPicPr>
+                  </pic:nvPicPr>
+                  <pic:blipFill>
+                    <a:blip r:embed="rId11"/>
+                    <a:stretch>
+                      <a:fillRect/>
+                    </a:stretch>
+                  </pic:blipFill>
+                  <pic:spPr>
+                    <a:xfrm>
+                      <a:off x="0" y="0"/>
+                      <a:ext cx="5524500" cy="2476500"/>
+                    </a:xfrm>
+                    <a:prstGeom prst="rect">
+                      <a:avLst/>
+                    </a:prstGeom>
+                  </pic:spPr>
+                </pic:pic>
+              </a:graphicData>
+            </a:graphic>
+          </wp:inline>
+        </w:drawing>
+      </w:r>
+    </w:p>
+    <w:p>
+      <w:r>
+        <w:rPr>
+          <w:b w:val="on"/>
+        </w:rPr>
+        <w:t xml:space="preserve"> Step1:Entering Person ID</w:t>
+        <w:br/>
+        <w:drawing>
+          <wp:inline distT="0" distR="0" distB="0" distL="0">
+            <wp:extent cx="5524500" cy="2476500"/>
+            <wp:docPr id="10" name="Drawing 10" descr="Step1:Entering Person ID"/>
+            <a:graphic xmlns:a="http://schemas.openxmlformats.org/drawingml/2006/main">
+              <a:graphicData uri="http://schemas.openxmlformats.org/drawingml/2006/picture">
+                <pic:pic xmlns:pic="http://schemas.openxmlformats.org/drawingml/2006/picture">
+                  <pic:nvPicPr>
+                    <pic:cNvPr id="0" name="Picture 10" descr="Step1:Entering Person ID"/>
+                    <pic:cNvPicPr>
+                      <a:picLocks noChangeAspect="true"/>
+                    </pic:cNvPicPr>
+                  </pic:nvPicPr>
+                  <pic:blipFill>
+                    <a:blip r:embed="rId12"/>
+                    <a:stretch>
+                      <a:fillRect/>
+                    </a:stretch>
+                  </pic:blipFill>
+                  <pic:spPr>
+                    <a:xfrm>
+                      <a:off x="0" y="0"/>
+                      <a:ext cx="5524500" cy="2476500"/>
+                    </a:xfrm>
+                    <a:prstGeom prst="rect">
+                      <a:avLst/>
+                    </a:prstGeom>
+                  </pic:spPr>
+                </pic:pic>
+              </a:graphicData>
+            </a:graphic>
+          </wp:inline>
+        </w:drawing>
+      </w:r>
+    </w:p>
+    <w:p>
+      <w:r>
+        <w:rPr>
+          <w:b w:val="on"/>
+        </w:rPr>
+        <w:t xml:space="preserve"> Step2:Person Details</w:t>
+        <w:br/>
+        <w:drawing>
+          <wp:inline distT="0" distR="0" distB="0" distL="0">
+            <wp:extent cx="5524500" cy="2476500"/>
+            <wp:docPr id="11" name="Drawing 11" descr="Step2:Person Details"/>
+            <a:graphic xmlns:a="http://schemas.openxmlformats.org/drawingml/2006/main">
+              <a:graphicData uri="http://schemas.openxmlformats.org/drawingml/2006/picture">
+                <pic:pic xmlns:pic="http://schemas.openxmlformats.org/drawingml/2006/picture">
+                  <pic:nvPicPr>
+                    <pic:cNvPr id="0" name="Picture 11" descr="Step2:Person Details"/>
+                    <pic:cNvPicPr>
+                      <a:picLocks noChangeAspect="true"/>
+                    </pic:cNvPicPr>
+                  </pic:nvPicPr>
+                  <pic:blipFill>
+                    <a:blip r:embed="rId13"/>
+                    <a:stretch>
+                      <a:fillRect/>
+                    </a:stretch>
+                  </pic:blipFill>
+                  <pic:spPr>
+                    <a:xfrm>
+                      <a:off x="0" y="0"/>
+                      <a:ext cx="5524500" cy="2476500"/>
+                    </a:xfrm>
+                    <a:prstGeom prst="rect">
+                      <a:avLst/>
+                    </a:prstGeom>
+                  </pic:spPr>
+                </pic:pic>
+              </a:graphicData>
+            </a:graphic>
+          </wp:inline>
+        </w:drawing>
+      </w:r>
+    </w:p>
+    <w:p>
+      <w:r>
+        <w:rPr>
+          <w:b w:val="on"/>
+        </w:rPr>
+        <w:t xml:space="preserve"> Step3:Entering Opportunity details</w:t>
+        <w:br/>
+        <w:drawing>
+          <wp:inline distT="0" distR="0" distB="0" distL="0">
+            <wp:extent cx="5524500" cy="2476500"/>
+            <wp:docPr id="12" name="Drawing 12" descr="Step3:Entering Opportunity details"/>
+            <a:graphic xmlns:a="http://schemas.openxmlformats.org/drawingml/2006/main">
+              <a:graphicData uri="http://schemas.openxmlformats.org/drawingml/2006/picture">
+                <pic:pic xmlns:pic="http://schemas.openxmlformats.org/drawingml/2006/picture">
+                  <pic:nvPicPr>
+                    <pic:cNvPr id="0" name="Picture 12" descr="Step3:Entering Opportunity details"/>
+                    <pic:cNvPicPr>
+                      <a:picLocks noChangeAspect="true"/>
+                    </pic:cNvPicPr>
+                  </pic:nvPicPr>
+                  <pic:blipFill>
+                    <a:blip r:embed="rId14"/>
+                    <a:stretch>
+                      <a:fillRect/>
+                    </a:stretch>
+                  </pic:blipFill>
+                  <pic:spPr>
+                    <a:xfrm>
+                      <a:off x="0" y="0"/>
+                      <a:ext cx="5524500" cy="2476500"/>
+                    </a:xfrm>
+                    <a:prstGeom prst="rect">
+                      <a:avLst/>
+                    </a:prstGeom>
+                  </pic:spPr>
+                </pic:pic>
+              </a:graphicData>
+            </a:graphic>
+          </wp:inline>
+        </w:drawing>
+      </w:r>
+    </w:p>
+    <w:p>
+      <w:r>
+        <w:rPr>
+          <w:b w:val="on"/>
+        </w:rPr>
+        <w:t xml:space="preserve"> Step4:Enter Start and end date</w:t>
+        <w:br/>
+        <w:drawing>
+          <wp:inline distT="0" distR="0" distB="0" distL="0">
+            <wp:extent cx="5524500" cy="2476500"/>
+            <wp:docPr id="13" name="Drawing 13" descr="Step4:Enter Start and end date"/>
+            <a:graphic xmlns:a="http://schemas.openxmlformats.org/drawingml/2006/main">
+              <a:graphicData uri="http://schemas.openxmlformats.org/drawingml/2006/picture">
+                <pic:pic xmlns:pic="http://schemas.openxmlformats.org/drawingml/2006/picture">
+                  <pic:nvPicPr>
+                    <pic:cNvPr id="0" name="Picture 13" descr="Step4:Enter Start and end date"/>
+                    <pic:cNvPicPr>
+                      <a:picLocks noChangeAspect="true"/>
+                    </pic:cNvPicPr>
+                  </pic:nvPicPr>
+                  <pic:blipFill>
+                    <a:blip r:embed="rId15"/>
+                    <a:stretch>
+                      <a:fillRect/>
+                    </a:stretch>
+                  </pic:blipFill>
+                  <pic:spPr>
+                    <a:xfrm>
+                      <a:off x="0" y="0"/>
+                      <a:ext cx="5524500" cy="2476500"/>
+                    </a:xfrm>
+                    <a:prstGeom prst="rect">
+                      <a:avLst/>
+                    </a:prstGeom>
+                  </pic:spPr>
+                </pic:pic>
+              </a:graphicData>
+            </a:graphic>
+          </wp:inline>
+        </w:drawing>
+      </w:r>
+    </w:p>
+    <w:p>
+      <w:r>
+        <w:rPr>
+          <w:b w:val="on"/>
+        </w:rPr>
+        <w:t xml:space="preserve"> Step5:Opportunity created in Identified status (ID: 3027972116 )</w:t>
+        <w:br/>
+        <w:drawing>
+          <wp:inline distT="0" distR="0" distB="0" distL="0">
+            <wp:extent cx="5524500" cy="2476500"/>
+            <wp:docPr id="14" name="Drawing 14" descr="Step5:Opportunity created in Identified status (ID: 3027972116 )"/>
+            <a:graphic xmlns:a="http://schemas.openxmlformats.org/drawingml/2006/main">
+              <a:graphicData uri="http://schemas.openxmlformats.org/drawingml/2006/picture">
+                <pic:pic xmlns:pic="http://schemas.openxmlformats.org/drawingml/2006/picture">
+                  <pic:nvPicPr>
+                    <pic:cNvPr id="0" name="Picture 14" descr="Step5:Opportunity created in Identified status (ID: 3027972116 )"/>
+                    <pic:cNvPicPr>
+                      <a:picLocks noChangeAspect="true"/>
+                    </pic:cNvPicPr>
+                  </pic:nvPicPr>
+                  <pic:blipFill>
+                    <a:blip r:embed="rId16"/>
+                    <a:stretch>
+                      <a:fillRect/>
+                    </a:stretch>
+                  </pic:blipFill>
+                  <pic:spPr>
+                    <a:xfrm>
+                      <a:off x="0" y="0"/>
+                      <a:ext cx="5524500" cy="2476500"/>
+                    </a:xfrm>
+                    <a:prstGeom prst="rect">
+                      <a:avLst/>
+                    </a:prstGeom>
+                  </pic:spPr>
+                </pic:pic>
+              </a:graphicData>
+            </a:graphic>
+          </wp:inline>
+        </w:drawing>
+      </w:r>
+    </w:p>
+    <w:p>
+      <w:r>
+        <w:rPr>
+          <w:b w:val="on"/>
+        </w:rPr>
+        <w:t xml:space="preserve"> Step6:Search Premise ID to add site</w:t>
+        <w:br/>
+        <w:drawing>
+          <wp:inline distT="0" distR="0" distB="0" distL="0">
+            <wp:extent cx="5524500" cy="2476500"/>
+            <wp:docPr id="15" name="Drawing 15" descr="Step6:Search Premise ID to add site"/>
+            <a:graphic xmlns:a="http://schemas.openxmlformats.org/drawingml/2006/main">
+              <a:graphicData uri="http://schemas.openxmlformats.org/drawingml/2006/picture">
+                <pic:pic xmlns:pic="http://schemas.openxmlformats.org/drawingml/2006/picture">
+                  <pic:nvPicPr>
+                    <pic:cNvPr id="0" name="Picture 15" descr="Step6:Search Premise ID to add site"/>
+                    <pic:cNvPicPr>
+                      <a:picLocks noChangeAspect="true"/>
+                    </pic:cNvPicPr>
+                  </pic:nvPicPr>
+                  <pic:blipFill>
+                    <a:blip r:embed="rId17"/>
+                    <a:stretch>
+                      <a:fillRect/>
+                    </a:stretch>
+                  </pic:blipFill>
+                  <pic:spPr>
+                    <a:xfrm>
+                      <a:off x="0" y="0"/>
+                      <a:ext cx="5524500" cy="2476500"/>
+                    </a:xfrm>
+                    <a:prstGeom prst="rect">
+                      <a:avLst/>
+                    </a:prstGeom>
+                  </pic:spPr>
+                </pic:pic>
+              </a:graphicData>
+            </a:graphic>
+          </wp:inline>
+        </w:drawing>
+      </w:r>
+    </w:p>
+    <w:p>
+      <w:r>
+        <w:rPr>
+          <w:b w:val="on"/>
+        </w:rPr>
+        <w:t xml:space="preserve"> Select MPAN</w:t>
+        <w:br/>
+        <w:drawing>
+          <wp:inline distT="0" distR="0" distB="0" distL="0">
+            <wp:extent cx="5524500" cy="2476500"/>
+            <wp:docPr id="16" name="Drawing 16" descr="Select MPAN"/>
+            <a:graphic xmlns:a="http://schemas.openxmlformats.org/drawingml/2006/main">
+              <a:graphicData uri="http://schemas.openxmlformats.org/drawingml/2006/picture">
+                <pic:pic xmlns:pic="http://schemas.openxmlformats.org/drawingml/2006/picture">
+                  <pic:nvPicPr>
+                    <pic:cNvPr id="0" name="Picture 16" descr="Select MPAN"/>
+                    <pic:cNvPicPr>
+                      <a:picLocks noChangeAspect="true"/>
+                    </pic:cNvPicPr>
+                  </pic:nvPicPr>
+                  <pic:blipFill>
+                    <a:blip r:embed="rId18"/>
+                    <a:stretch>
+                      <a:fillRect/>
+                    </a:stretch>
+                  </pic:blipFill>
+                  <pic:spPr>
+                    <a:xfrm>
+                      <a:off x="0" y="0"/>
+                      <a:ext cx="5524500" cy="2476500"/>
+                    </a:xfrm>
+                    <a:prstGeom prst="rect">
+                      <a:avLst/>
+                    </a:prstGeom>
+                  </pic:spPr>
+                </pic:pic>
+              </a:graphicData>
+            </a:graphic>
+          </wp:inline>
+        </w:drawing>
+      </w:r>
+    </w:p>
+    <w:p>
+      <w:r>
+        <w:rPr>
+          <w:b w:val="on"/>
+        </w:rPr>
+        <w:t xml:space="preserve"> Site added succesfully.</w:t>
+        <w:br/>
+        <w:drawing>
+          <wp:inline distT="0" distR="0" distB="0" distL="0">
+            <wp:extent cx="5524500" cy="2476500"/>
+            <wp:docPr id="17" name="Drawing 17" descr="Site added succesfully."/>
+            <a:graphic xmlns:a="http://schemas.openxmlformats.org/drawingml/2006/main">
+              <a:graphicData uri="http://schemas.openxmlformats.org/drawingml/2006/picture">
+                <pic:pic xmlns:pic="http://schemas.openxmlformats.org/drawingml/2006/picture">
+                  <pic:nvPicPr>
+                    <pic:cNvPr id="0" name="Picture 17" descr="Site added succesfully."/>
+                    <pic:cNvPicPr>
+                      <a:picLocks noChangeAspect="true"/>
+                    </pic:cNvPicPr>
+                  </pic:nvPicPr>
+                  <pic:blipFill>
+                    <a:blip r:embed="rId19"/>
+                    <a:stretch>
+                      <a:fillRect/>
+                    </a:stretch>
+                  </pic:blipFill>
+                  <pic:spPr>
+                    <a:xfrm>
+                      <a:off x="0" y="0"/>
+                      <a:ext cx="5524500" cy="2476500"/>
+                    </a:xfrm>
+                    <a:prstGeom prst="rect">
+                      <a:avLst/>
+                    </a:prstGeom>
+                  </pic:spPr>
+                </pic:pic>
+              </a:graphicData>
+            </a:graphic>
+          </wp:inline>
+        </w:drawing>
+      </w:r>
+    </w:p>
+    <w:p>
+      <w:r>
+        <w:rPr>
+          <w:b w:val="on"/>
+        </w:rPr>
+        <w:t xml:space="preserve"> Credit Check Processed Succesfully</w:t>
+        <w:br/>
+        <w:drawing>
+          <wp:inline distT="0" distR="0" distB="0" distL="0">
+            <wp:extent cx="5524500" cy="2476500"/>
+            <wp:docPr id="18" name="Drawing 18" descr="Credit Check Processed Succesfully"/>
+            <a:graphic xmlns:a="http://schemas.openxmlformats.org/drawingml/2006/main">
+              <a:graphicData uri="http://schemas.openxmlformats.org/drawingml/2006/picture">
+                <pic:pic xmlns:pic="http://schemas.openxmlformats.org/drawingml/2006/picture">
+                  <pic:nvPicPr>
+                    <pic:cNvPr id="0" name="Picture 18" descr="Credit Check Processed Succesfully"/>
+                    <pic:cNvPicPr>
+                      <a:picLocks noChangeAspect="true"/>
+                    </pic:cNvPicPr>
+                  </pic:nvPicPr>
+                  <pic:blipFill>
+                    <a:blip r:embed="rId20"/>
+                    <a:stretch>
+                      <a:fillRect/>
+                    </a:stretch>
+                  </pic:blipFill>
+                  <pic:spPr>
+                    <a:xfrm>
+                      <a:off x="0" y="0"/>
+                      <a:ext cx="5524500" cy="2476500"/>
+                    </a:xfrm>
+                    <a:prstGeom prst="rect">
+                      <a:avLst/>
+                    </a:prstGeom>
+                  </pic:spPr>
+                </pic:pic>
+              </a:graphicData>
+            </a:graphic>
+          </wp:inline>
+        </w:drawing>
+      </w:r>
+    </w:p>
+    <w:p>
+      <w:r>
+        <w:rPr>
+          <w:b w:val="on"/>
+        </w:rPr>
+        <w:t xml:space="preserve"> Opportunity Qualified</w:t>
+        <w:br/>
+        <w:drawing>
+          <wp:inline distT="0" distR="0" distB="0" distL="0">
+            <wp:extent cx="5524500" cy="2476500"/>
+            <wp:docPr id="19" name="Drawing 19" descr="Opportunity Qualified"/>
+            <a:graphic xmlns:a="http://schemas.openxmlformats.org/drawingml/2006/main">
+              <a:graphicData uri="http://schemas.openxmlformats.org/drawingml/2006/picture">
+                <pic:pic xmlns:pic="http://schemas.openxmlformats.org/drawingml/2006/picture">
+                  <pic:nvPicPr>
+                    <pic:cNvPr id="0" name="Picture 19" descr="Opportunity Qualified"/>
+                    <pic:cNvPicPr>
+                      <a:picLocks noChangeAspect="true"/>
+                    </pic:cNvPicPr>
+                  </pic:nvPicPr>
+                  <pic:blipFill>
+                    <a:blip r:embed="rId21"/>
                     <a:stretch>
                       <a:fillRect/>
                     </a:stretch>

</xml_diff>

<commit_message>
commit with new connection update
</commit_message>
<xml_diff>
--- a/New_Connection.docx
+++ b/New_Connection.docx
@@ -175,17 +175,17 @@
         <w:rPr>
           <w:b w:val="on"/>
         </w:rPr>
-        <w:t xml:space="preserve"> Step5:Opportunity created in Identified status (ID: 8052186083 )</w:t>
-        <w:br/>
-        <w:drawing>
-          <wp:inline distT="0" distR="0" distB="0" distL="0">
-            <wp:extent cx="5524500" cy="2476500"/>
-            <wp:docPr id="4" name="Drawing 4" descr="Step5:Opportunity created in Identified status (ID: 8052186083 )"/>
-            <a:graphic xmlns:a="http://schemas.openxmlformats.org/drawingml/2006/main">
-              <a:graphicData uri="http://schemas.openxmlformats.org/drawingml/2006/picture">
-                <pic:pic xmlns:pic="http://schemas.openxmlformats.org/drawingml/2006/picture">
-                  <pic:nvPicPr>
-                    <pic:cNvPr id="0" name="Picture 4" descr="Step5:Opportunity created in Identified status (ID: 8052186083 )"/>
+        <w:t xml:space="preserve"> Step5:Opportunity created in Identified status (ID: 3814067775 )</w:t>
+        <w:br/>
+        <w:drawing>
+          <wp:inline distT="0" distR="0" distB="0" distL="0">
+            <wp:extent cx="5524500" cy="2476500"/>
+            <wp:docPr id="4" name="Drawing 4" descr="Step5:Opportunity created in Identified status (ID: 3814067775 )"/>
+            <a:graphic xmlns:a="http://schemas.openxmlformats.org/drawingml/2006/main">
+              <a:graphicData uri="http://schemas.openxmlformats.org/drawingml/2006/picture">
+                <pic:pic xmlns:pic="http://schemas.openxmlformats.org/drawingml/2006/picture">
+                  <pic:nvPicPr>
+                    <pic:cNvPr id="0" name="Picture 4" descr="Step5:Opportunity created in Identified status (ID: 3814067775 )"/>
                     <pic:cNvPicPr>
                       <a:picLocks noChangeAspect="true"/>
                     </pic:cNvPicPr>
@@ -595,17 +595,17 @@
         <w:rPr>
           <w:b w:val="on"/>
         </w:rPr>
-        <w:t xml:space="preserve"> Step5:Opportunity created in Identified status (ID: 3027972116 )</w:t>
-        <w:br/>
-        <w:drawing>
-          <wp:inline distT="0" distR="0" distB="0" distL="0">
-            <wp:extent cx="5524500" cy="2476500"/>
-            <wp:docPr id="14" name="Drawing 14" descr="Step5:Opportunity created in Identified status (ID: 3027972116 )"/>
-            <a:graphic xmlns:a="http://schemas.openxmlformats.org/drawingml/2006/main">
-              <a:graphicData uri="http://schemas.openxmlformats.org/drawingml/2006/picture">
-                <pic:pic xmlns:pic="http://schemas.openxmlformats.org/drawingml/2006/picture">
-                  <pic:nvPicPr>
-                    <pic:cNvPr id="0" name="Picture 14" descr="Step5:Opportunity created in Identified status (ID: 3027972116 )"/>
+        <w:t xml:space="preserve"> Step5:Opportunity created in Identified status (ID: 1197705291 )</w:t>
+        <w:br/>
+        <w:drawing>
+          <wp:inline distT="0" distR="0" distB="0" distL="0">
+            <wp:extent cx="5524500" cy="2476500"/>
+            <wp:docPr id="14" name="Drawing 14" descr="Step5:Opportunity created in Identified status (ID: 1197705291 )"/>
+            <a:graphic xmlns:a="http://schemas.openxmlformats.org/drawingml/2006/main">
+              <a:graphicData uri="http://schemas.openxmlformats.org/drawingml/2006/picture">
+                <pic:pic xmlns:pic="http://schemas.openxmlformats.org/drawingml/2006/picture">
+                  <pic:nvPicPr>
+                    <pic:cNvPr id="0" name="Picture 14" descr="Step5:Opportunity created in Identified status (ID: 1197705291 )"/>
                     <pic:cNvPicPr>
                       <a:picLocks noChangeAspect="true"/>
                     </pic:cNvPicPr>

</xml_diff>

<commit_message>
Updated with comc15 errors
</commit_message>
<xml_diff>
--- a/New_Connection.docx
+++ b/New_Connection.docx
@@ -175,17 +175,17 @@
         <w:rPr>
           <w:b w:val="on"/>
         </w:rPr>
-        <w:t xml:space="preserve"> Step5:Opportunity created in Identified status (ID: 3764822237 )</w:t>
-        <w:br/>
-        <w:drawing>
-          <wp:inline distT="0" distR="0" distB="0" distL="0">
-            <wp:extent cx="5524500" cy="2476500"/>
-            <wp:docPr id="4" name="Drawing 4" descr="Step5:Opportunity created in Identified status (ID: 3764822237 )"/>
-            <a:graphic xmlns:a="http://schemas.openxmlformats.org/drawingml/2006/main">
-              <a:graphicData uri="http://schemas.openxmlformats.org/drawingml/2006/picture">
-                <pic:pic xmlns:pic="http://schemas.openxmlformats.org/drawingml/2006/picture">
-                  <pic:nvPicPr>
-                    <pic:cNvPr id="0" name="Picture 4" descr="Step5:Opportunity created in Identified status (ID: 3764822237 )"/>
+        <w:t xml:space="preserve"> Step5:Opportunity created in Identified status (ID: 1316752250 )</w:t>
+        <w:br/>
+        <w:drawing>
+          <wp:inline distT="0" distR="0" distB="0" distL="0">
+            <wp:extent cx="5524500" cy="2476500"/>
+            <wp:docPr id="4" name="Drawing 4" descr="Step5:Opportunity created in Identified status (ID: 1316752250 )"/>
+            <a:graphic xmlns:a="http://schemas.openxmlformats.org/drawingml/2006/main">
+              <a:graphicData uri="http://schemas.openxmlformats.org/drawingml/2006/picture">
+                <pic:pic xmlns:pic="http://schemas.openxmlformats.org/drawingml/2006/picture">
+                  <pic:nvPicPr>
+                    <pic:cNvPr id="0" name="Picture 4" descr="Step5:Opportunity created in Identified status (ID: 1316752250 )"/>
                     <pic:cNvPicPr>
                       <a:picLocks noChangeAspect="true"/>
                     </pic:cNvPicPr>
@@ -595,17 +595,17 @@
         <w:rPr>
           <w:b w:val="on"/>
         </w:rPr>
-        <w:t xml:space="preserve"> Step5:Opportunity created in Identified status (ID: 7929650343 )</w:t>
-        <w:br/>
-        <w:drawing>
-          <wp:inline distT="0" distR="0" distB="0" distL="0">
-            <wp:extent cx="5524500" cy="2476500"/>
-            <wp:docPr id="14" name="Drawing 14" descr="Step5:Opportunity created in Identified status (ID: 7929650343 )"/>
-            <a:graphic xmlns:a="http://schemas.openxmlformats.org/drawingml/2006/main">
-              <a:graphicData uri="http://schemas.openxmlformats.org/drawingml/2006/picture">
-                <pic:pic xmlns:pic="http://schemas.openxmlformats.org/drawingml/2006/picture">
-                  <pic:nvPicPr>
-                    <pic:cNvPr id="0" name="Picture 14" descr="Step5:Opportunity created in Identified status (ID: 7929650343 )"/>
+        <w:t xml:space="preserve"> Step5:Opportunity created in Identified status (ID: 0420829170 )</w:t>
+        <w:br/>
+        <w:drawing>
+          <wp:inline distT="0" distR="0" distB="0" distL="0">
+            <wp:extent cx="5524500" cy="2476500"/>
+            <wp:docPr id="14" name="Drawing 14" descr="Step5:Opportunity created in Identified status (ID: 0420829170 )"/>
+            <a:graphic xmlns:a="http://schemas.openxmlformats.org/drawingml/2006/main">
+              <a:graphicData uri="http://schemas.openxmlformats.org/drawingml/2006/picture">
+                <pic:pic xmlns:pic="http://schemas.openxmlformats.org/drawingml/2006/picture">
+                  <pic:nvPicPr>
+                    <pic:cNvPr id="0" name="Picture 14" descr="Step5:Opportunity created in Identified status (ID: 0420829170 )"/>
                     <pic:cNvPicPr>
                       <a:picLocks noChangeAspect="true"/>
                     </pic:cNvPicPr>

</xml_diff>